<commit_message>
Draft_078: remove semicolons from new multi-citation lists
</commit_message>
<xml_diff>
--- a/thesis/003_ThesisProposal_Draft_078.docx
+++ b/thesis/003_ThesisProposal_Draft_078.docx
@@ -490,7 +490,7 @@
           <w:sz w:val="24"/>
           <w:szCs w:val="24"/>
         </w:rPr>
-        <w:t xml:space="preserve">Developing researchers tend to underuse hedges and rely on a narrow set of devices (Khunasathitchai et al., 2025; Suratno &amp; Aydawati, 2025; Ghia et al., 2022; Mazidah et al., 2022). Khunasathitchai et al. (2025) found an average of only 1.47 hedges per abstract in 60 Thai undergraduate English-major research abstracts, with modal verbs dominant. Suratno and Aydawati (2025) reported a similar pattern in the discussion sections of Indonesian undergraduate theses: heavy reliance on a single modal (dapat), which they link to limited exposure rather than weak grammar. Ghia et al. (2022) analyzed 217 English thesis abstracts by advanced Italian EFL undergraduates and found fewer hedges than L1-English peers in MICUSP, with more reliance on boosters and certainty-oriented modals. Mazidah et al. (2022) compared undergraduate thesis abstracts in English education and mathematics at an Indonesian university and found that English majors used more hedges while mathematics majors used more boosters. On a larger scale, Wang (2022) examined 829 papers across 16 fields in the Michigan Corpus of Upper-Level Student Papers and confirmed that disciplinary variation is detectable even among developing writers. Philosophy and Psychology hedged more than Physics and History, yet modal verbs remained the dominant form across disciplines.</w:t>
+        <w:t xml:space="preserve">Developing researchers tend to underuse hedges and rely on a narrow set of devices (Khunasathitchai et al., 2025, Suratno &amp; Aydawati, 2025, Ghia et al., 2022, and Mazidah et al., 2022). Khunasathitchai et al. (2025) found an average of only 1.47 hedges per abstract in 60 Thai undergraduate English-major research abstracts, with modal verbs dominant. Suratno and Aydawati (2025) reported a similar pattern in the discussion sections of Indonesian undergraduate theses: heavy reliance on a single modal (dapat), which they link to limited exposure rather than weak grammar. Ghia et al. (2022) analyzed 217 English thesis abstracts by advanced Italian EFL undergraduates and found fewer hedges than L1-English peers in MICUSP, with more reliance on boosters and certainty-oriented modals. Mazidah et al. (2022) compared undergraduate thesis abstracts in English education and mathematics at an Indonesian university and found that English majors used more hedges while mathematics majors used more boosters. On a larger scale, Wang (2022) examined 829 papers across 16 fields in the Michigan Corpus of Upper-Level Student Papers and confirmed that disciplinary variation is detectable even among developing writers. Philosophy and Psychology hedged more than Physics and History, yet modal verbs remained the dominant form across disciplines.</w:t>
       </w:r>
     </w:p>
     <w:p>
@@ -752,7 +752,7 @@
           <w:sz w:val="24"/>
           <w:szCs w:val="24"/>
         </w:rPr>
-        <w:t xml:space="preserve">Across the literature, expert writers show measurable disciplinary differentiation in hedging shaped by epistemic demands rather than a simple hard/soft divide (Salager-Meyer, 1994; Afshar et al., 2014; Hyland, 1996; Souici &amp; Slougui, 2022). Developing researchers across contexts show limited hedge variety and tend to default to modal verbs (Khunasathitchai et al., 2025; Wang, 2022; Ghia et al., 2022; Mazidah et al., 2022). L2 writers face additional constraints from linguistic factors, publication context, and limited explicit instruction (Demir, 2018; Hu &amp; Cao, 2011; Petchkij, 2019). Philippine and ASEAN studies confirm reliance on modals and, in some contexts, a preference for boosters (Ningrum et al., 2024; Escalona, 2025; Lopez et al., 2025). Abstract-focused work further shows that caution and promotion vary by discipline and ranking (Xie &amp; Mi, 2023), but undergraduate applied-science abstracts remain underdescribed.</w:t>
+        <w:t xml:space="preserve">Across the literature, expert writers show measurable disciplinary differentiation in hedging shaped by epistemic demands rather than a simple hard/soft divide (Salager-Meyer, 1994, Afshar et al., 2014, Hyland, 1996, and Souici &amp; Slougui, 2022). Developing researchers across contexts show limited hedge variety and tend to default to modal verbs (Khunasathitchai et al., 2025, Wang, 2022, Ghia et al., 2022, and Mazidah et al., 2022). L2 writers face additional constraints from linguistic factors, publication context, and limited explicit instruction (Demir, 2018, Hu &amp; Cao, 2011, and Petchkij, 2019). Philippine and ASEAN studies confirm reliance on modals and, in some contexts, a preference for boosters (Ningrum et al., 2024, Escalona, 2025, and Lopez et al., 2025). Abstract-focused work further shows that caution and promotion vary by discipline and ranking (Xie &amp; Mi, 2023), but undergraduate applied-science abstracts remain underdescribed.</w:t>
       </w:r>
     </w:p>
     <w:p>

</xml_diff>

<commit_message>
Draft_078: grammar/tense fixes (mapped, contain, method, a comparable, a research topic, focused)
</commit_message>
<xml_diff>
--- a/thesis/003_ThesisProposal_Draft_078.docx
+++ b/thesis/003_ThesisProposal_Draft_078.docx
@@ -851,7 +851,7 @@
           <w:szCs w:val="22"/>
           <w:rtl w:val="0"/>
         </w:rPr>
-        <w:t xml:space="preserve">This study maps hedging patterns in undergraduate thesis abstracts from Agriculture, Veterinary Medicine, and Biology at PSAU. It asks:</w:t>
+        <w:t xml:space="preserve">This study mapped hedging patterns in undergraduate thesis abstracts from Agriculture, Veterinary Medicine, and Biology at PSAU. It asks:</w:t>
       </w:r>
       <w:r>
         <w:rPr>
@@ -1378,7 +1378,7 @@
           <w:szCs w:val="22"/>
           <w:rtl w:val="0"/>
         </w:rPr>
-        <w:t>This study focuses on undergraduate thesis abstracts from Agriculture, Veterinary Medicine, and Biology at PSAU. The inclusion window refers to the year of hard-bound submission as recorded in the PSAU library catalog, not the year the research was conducted. Theses conducted earlier but bound and catalogued in 2023–2025 are included. This reflects institutional practice in which submission date, particularly for irregular students, may postdate the research period by several years. The corpus consisted of 60 abstracts (20 per discipline, with Agriculture split evenly between Crop Science and Animal Science). Sampling design, stratum intervals, and inclusion/exclusion criteria are detailed under Research Corpus. Table 1 reports population and sample sizes. Sub-programs are analyzed as a single “Agriculture” discipline for cross-disciplinary comparison. No separate inferential comparison between them is undertaken.</w:t>
+        <w:t xml:space="preserve">This study focused on undergraduate thesis abstracts from Agriculture, Veterinary Medicine, and Biology at PSAU. The inclusion window refers to the year of hard-bound submission as recorded in the PSAU library catalog, not the year the research was conducted. Theses conducted earlier but bound and catalogued in 2023–2025 are included. This reflects institutional practice in which submission date, particularly for irregular students, may postdate the research period by several years. The corpus consisted of 60 abstracts (20 per discipline, with Agriculture split evenly between Crop Science and Animal Science). Sampling design, stratum intervals, and inclusion/exclusion criteria are detailed under Research Corpus. Table 1 reports population and sample sizes. Sub-programs are analyzed as a single “Agriculture” discipline for cross-disciplinary comparison. No separate inferential comparison between them is undertaken.</w:t>
       </w:r>
       <w:r>
         <w:rPr>
@@ -1430,7 +1430,7 @@
           <w:szCs w:val="22"/>
           <w:rtl w:val="0"/>
         </w:rPr>
-        <w:t xml:space="preserve">The study is delimited to complete English-language abstracts. Abstracts with significant Filipino code-switching are excluded to maintain linguistic consistency. Disciplinary classification followed the degree program under which each thesis was officially submitted, not the research topic, to ensure objective categorization. L2 proficiency is not measured as a variable. Where patterns suggest proficiency effects alongside disciplinary ones, this is noted as a limitation requiring future research with proficiency controls.</w:t>
+        <w:t xml:space="preserve">The study is delimited to complete English-language abstracts. Abstracts with significant Filipino code-switching are excluded to maintain linguistic consistency. Disciplinary classification followed the degree program under which each thesis was officially submitted, not a research topic, to ensure objective categorization. L2 proficiency is not measured as a variable. Where patterns suggest proficiency effects alongside disciplinary ones, this is noted as a limitation requiring future research with proficiency controls.</w:t>
       </w:r>
       <w:r>
         <w:rPr>
@@ -2736,7 +2736,7 @@
           <w:b w:val="0"/>
           <w:bCs w:val="0"/>
         </w:rPr>
-        <w:t>Disproportionate stratified systematic sampling was used, with discipline as the stratification variable and fixed analytical targets per stratum to ensure equal representation regardless of population size. The target sample sizes were n=20 for Biology, n=20 for Veterinary Medicine, n=10 for Agriculture, Animal Science, and n=10 for Agriculture, Crop Science, totaling 60 abstracts. Within each stratum, a sampling interval k was calculated as k = N/n, where N is the stratum’s target pool size (theses completed 2023–2025) and n is the required sample size. The intervals were as follows: Biology k=7 (145÷20=7.25), Veterinary Medicine k=5 (104÷20=5.2), Animal Science k=4 (38÷10=3.8), and Crop Science k=9 (94÷10=9.4). Sampling began from a randomly selected position around the middle of each stratum’s catalog and proceeded forward by taking every kth thesis. Where the end of the stratum was reached before the required sample size, counting wrapped around to the beginning of the catalog and continued until the target sample was met. Disciplinary classification followed the degree program under which each thesis was officially submitted (e.g., B.S. Agriculture, B.S. Biology, D.V.M.), not research topic, to ensure objective categorization.</w:t>
+        <w:t xml:space="preserve">Disproportionate stratified systematic sampling was used, with discipline as the stratification variable and fixed analytical targets per stratum to ensure equal representation regardless of population size. The target sample sizes were n=20 for Biology, n=20 for Veterinary Medicine, n=10 for Agriculture, Animal Science, and n=10 for Agriculture, Crop Science, totaling 60 abstracts. Within each stratum, a sampling interval k was calculated as k = N/n, where N is the stratum’s target pool size (theses completed 2023–2025) and n is the required sample size. The intervals were as follows: Biology k=7 (145÷20=7.25), Veterinary Medicine k=5 (104÷20=5.2), Animal Science k=4 (38÷10=3.8), and Crop Science k=9 (94÷10=9.4). Sampling began from a randomly selected position around the middle of each stratum’s catalog and proceeded forward by taking every kth thesis. Where the end of the stratum was reached before the required sample size, counting wrapped around to the beginning of the catalog and continued until the target sample was met. Disciplinary classification followed the degree program under which each thesis was officially submitted (e.g., B.S. Agriculture, B.S. Biology, D.V.M.), not a research topic, to ensure objective categorization.</w:t>
       </w:r>
       <w:r>
         <w:rPr>
@@ -2931,7 +2931,7 @@
           <w:szCs w:val="22"/>
           <w:rtl w:val="0"/>
         </w:rPr>
-        <w:t xml:space="preserve">Ambiguous forms such as can, potential, indicating, and possibility may function either as epistemic hedges or as non-epistemic lexical items depending on context. The following decision rules govern these cases. First, “can” combined with an active content verb describing a treatment effect (enhance, promote, reduce, help) is classified as capability (FP-Cap) regardless of whether it appears inside a “suggests that” clause, because the Working Test shows that removing “can” alone does not change the epistemic weight of the clause when “suggests” is already carrying the hedge. Second, the “indicating” tautology test covers not only numeric restatement but also field-standard interpretive thresholds: “non-toxic” from no mortality observed, “limited benefits” from poor performance, and “superior feed efficiency” from lower feed conversion ratio are treated as operational restatements (FP-Gen) rather than inferential hedges. Third, for “potential + noun” constructions, structural position is the primary disambiguator. Aim, methods, and pure topic-naming frames are coded FP-Gen, as when an abstract “explores the potential antifungal properties” of a plant or names “potential pharmaceutical applications” as the object of further study. Results and conclusion frames that qualify a finding-claim are coded Lexical EC. The Working Test applies as a secondary check. When removing the token clearly changes commitment to a proposition, for example when “presence of potential mycobacterial infections” becomes an asserted presence claim without the modifier, the token is coded Lexical EC even in an aim or rationale sentence. The same position-based treatment applies to “possibility + noun” in aim and methods sentences. Fourth, when a sentence contains multiple hedge-like tokens, each token is tested individually in isolation, ignoring the other hedges in the sentence. A token counts only if removing it alone changes the epistemic weight of its own clause. The corpus therefore reflects contextual rather than purely lexical classification, and the 58 rejected candidates document the decision trail for tokens that were considered but excluded. Additionally, the outlier abstract Acs2 uses a repeated hedging template (“This suggests that while X might not have been Y, Z could still [verb] beneficial effects”) twice with light variation, inflating its own token count through formulaic repetition rather than independent hedging decisions.</w:t>
+        <w:t xml:space="preserve">Ambiguous forms such as can, potential, indicating, and possibility may function either as epistemic hedges or as non-epistemic lexical items depending on context. The following decision rules govern these cases. First, “can” combined with an active content verb describing a treatment effect (enhance, promote, reduce, help) is classified as capability (FP-Cap) regardless of whether it appears inside a “suggests that” clause, because the Working Test shows that removing “can” alone does not change the epistemic weight of the clause when “suggests” is already carrying the hedge. Second, the “indicating” tautology test covers not only numeric restatement but also field-standard interpretive thresholds: “non-toxic” from no mortality observed, “limited benefits” from poor performance, and “superior feed efficiency” from lower feed conversion ratio are treated as operational restatements (FP-Gen) rather than inferential hedges. Third, for “potential + noun” constructions, structural position is the primary disambiguator. Aim, methods, and pure topic-naming frames are coded FP-Gen, as when an abstract “explores the potential antifungal properties” of a plant or names “potential pharmaceutical applications” as the object of further study. Results and conclusion frames that qualify a finding-claim are coded Lexical EC. The Working Test applies as a secondary check. When removing the token clearly changes commitment to a proposition, for example when “presence of potential mycobacterial infections” becomes an asserted presence claim without the modifier, the token is coded Lexical EC even in an aim or rationale sentence. The same position-based treatment applies to “possibility + noun” in aim and method sentences. Fourth, when a sentence contains multiple hedge-like tokens, each token is tested individually in isolation, ignoring the other hedges in the sentence. A token counts only if removing it alone changes the epistemic weight of its own clause. The corpus therefore reflects contextual rather than purely lexical classification, and the 58 rejected candidates document the decision trail for tokens that were considered but excluded. Additionally, the outlier abstract Acs2 uses a repeated hedging template (“This suggests that while X might not have been Y, Z could still [verb] beneficial effects”) twice with light variation, inflating its own token count through formulaic repetition rather than independent hedging decisions.</w:t>
       </w:r>
     </w:p>
     <w:p>
@@ -2978,7 +2978,7 @@
           <w:szCs w:val="22"/>
           <w:rtl w:val="0"/>
         </w:rPr>
-        <w:t>This study used a text corpus rather than human participants. The corpus consisted of 60 undergraduate thesis abstracts from Agriculture, Veterinary Medicine, and Biology programs at PSAU. This study employed disproportionate stratified systematic sampling, with discipline as the stratification variable and fixed analytical targets per stratum (n=20 for Biology, n=20 for Veterinary Medicine, n=10 for Animal Science, and n=10 for Crop Science) to ensure equal representation regardless of population size. This meant the sampling rate varied by population size, prioritizing equal sample sizes over proportional representation. For the Agriculture discipline, the sample was equally split between Crop Science (n=10) and Animal Science (n=10) to ensure balanced representation of the sub-disciplines. Within each stratum, a sampling interval k was calculated as k = N/n. The intervals were Biology k=7 (145÷20=7.25), Veterinary Medicine k=5 (104÷20=5.2), Animal Science k=4 (38÷10=3.8), and Crop Science k=9 (94÷10=9.4). Sampling began from a randomly selected position around the middle of each stratum’s catalog, proceeded forward by taking every kth thesis, and wrapped around to the beginning of the catalog when needed until the target sample was met. This sample size is appropriate for the study’s scope. Khunasathitchai et al. (2025) used 60 abstracts in a comparable corpus study. Wang (2022) examined a much larger multi-field student corpus. The present study does not claim comparable scale. For a manually coded functional analysis at a single institution, 60 texts allow sufficient depth of interpretation within the timeframe and resources of a BA thesis. The study treated findings as baseline descriptive data for institutional curriculum review.</w:t>
+        <w:t xml:space="preserve">This study used a text corpus rather than human participants. The corpus consisted of 60 undergraduate thesis abstracts from Agriculture, Veterinary Medicine, and Biology programs at PSAU. This study employed disproportionate stratified systematic sampling, with discipline as the stratification variable and fixed analytical targets per stratum (n=20 for Biology, n=20 for Veterinary Medicine, n=10 for Animal Science, and n=10 for Crop Science) to ensure equal representation regardless of population size. This meant the sampling rate varied by population size, prioritizing equal sample sizes over proportional representation. For the Agriculture discipline, the sample was equally split between Crop Science (n=10) and Animal Science (n=10) to ensure balanced representation of the sub-disciplines. Within each stratum, a sampling interval k was calculated as k = N/n. The intervals were Biology k=7 (145÷20=7.25), Veterinary Medicine k=5 (104÷20=5.2), Animal Science k=4 (38÷10=3.8), and Crop Science k=9 (94÷10=9.4). Sampling began from a randomly selected position around the middle of each stratum’s catalog, proceeded forward by taking every kth thesis, and wrapped around to the beginning of the catalog when needed until the target sample was met. This sample size is appropriate for the study’s scope. Khunasathitchai et al. (2025) used 60 abstracts in a comparable corpus study. Wang (2022) examined a much larger multi-field student corpus. The present study does not claim a comparable scale. For a manually coded functional analysis at a single institution, 60 texts allow sufficient depth of interpretation within the timeframe and resources of a BA thesis. The study treated findings as baseline descriptive data for institutional curriculum review.</w:t>
       </w:r>
       <w:r>
         <w:rPr>
@@ -9798,7 +9798,7 @@
           <w:szCs w:val="22"/>
           <w:rtl w:val="0"/>
         </w:rPr>
-        <w:t>The false positive distribution also varies by discipline. Biology produced 32 false positives, far more than Agriculture (14) or Veterinary Medicine (12). This is partly because Biology abstracts contained more instances of “potential” in aim statements and “indicated by” evidential pointers, constructions that look like hedges but do not express uncertainty about a claim. The higher false positive count in Biology does not necessarily mean Biology writers hedge more. It means they use more hedge-like vocabulary in non-hedging functions.</w:t>
+        <w:t xml:space="preserve">The false positive distribution also varies by discipline. Biology produced 32 false positives, far more than Agriculture (14) or Veterinary Medicine (12). This is partly because Biology abstracts contain more instances of “potential” in aim statements and “indicated by” evidential pointers, constructions that look like hedges but do not express uncertainty about a claim. The higher false positive count in Biology does not necessarily mean Biology writers hedge more. It means they use more hedge-like vocabulary in non-hedging functions.</w:t>
       </w:r>
       <w:r>
         <w:rPr>

</xml_diff>